<commit_message>
Updated Previous Assignements Lec 8 and 9
</commit_message>
<xml_diff>
--- a/Lecture/Lecture8/PoudelS_LabAssignment08.docx
+++ b/Lecture/Lecture8/PoudelS_LabAssignment08.docx
@@ -14,7 +14,7 @@
       </w:pPr>
       <w:r>
         <w:drawing>
-          <wp:inline wp14:editId="40A985BC" wp14:anchorId="15D5D1DE">
+          <wp:inline wp14:editId="4B48D060" wp14:anchorId="15D5D1DE">
             <wp:extent cx="5943600" cy="3352800"/>
             <wp:effectExtent l="0" t="0" r="0" b="0"/>
             <wp:docPr id="1440120803" name="drawing"/>
@@ -57,7 +57,7 @@
       </w:r>
       <w:r>
         <w:drawing>
-          <wp:inline wp14:editId="57CCE583" wp14:anchorId="00CA5FA3">
+          <wp:inline wp14:editId="33045AE9" wp14:anchorId="00CA5FA3">
             <wp:extent cx="5943600" cy="3352800"/>
             <wp:effectExtent l="0" t="0" r="0" b="0"/>
             <wp:docPr id="397543049" name="drawing"/>
@@ -100,7 +100,7 @@
       </w:r>
       <w:r>
         <w:drawing>
-          <wp:inline wp14:editId="4D0678E4" wp14:anchorId="20559E60">
+          <wp:inline wp14:editId="7ECA8A64" wp14:anchorId="20559E60">
             <wp:extent cx="5943600" cy="3352800"/>
             <wp:effectExtent l="0" t="0" r="0" b="0"/>
             <wp:docPr id="764436991" name="drawing"/>
@@ -143,7 +143,7 @@
       </w:r>
       <w:r>
         <w:drawing>
-          <wp:inline wp14:editId="68AB6A6F" wp14:anchorId="72E52A09">
+          <wp:inline wp14:editId="04DC0009" wp14:anchorId="72E52A09">
             <wp:extent cx="5943600" cy="3352800"/>
             <wp:effectExtent l="0" t="0" r="0" b="0"/>
             <wp:docPr id="829811223" name="drawing"/>
@@ -186,7 +186,7 @@
       </w:r>
       <w:r>
         <w:drawing>
-          <wp:inline wp14:editId="616E496A" wp14:anchorId="5A714DE8">
+          <wp:inline wp14:editId="24A80F22" wp14:anchorId="5A714DE8">
             <wp:extent cx="5943600" cy="3352800"/>
             <wp:effectExtent l="0" t="0" r="0" b="0"/>
             <wp:docPr id="22212890" name="drawing"/>
@@ -229,7 +229,7 @@
       </w:r>
       <w:r>
         <w:drawing>
-          <wp:inline wp14:editId="52BF726B" wp14:anchorId="213CF335">
+          <wp:inline wp14:editId="7A568A81" wp14:anchorId="213CF335">
             <wp:extent cx="5943600" cy="3352800"/>
             <wp:effectExtent l="0" t="0" r="0" b="0"/>
             <wp:docPr id="498322260" name="drawing"/>
@@ -272,7 +272,7 @@
       </w:r>
       <w:r>
         <w:drawing>
-          <wp:inline wp14:editId="2284D50F" wp14:anchorId="1409C526">
+          <wp:inline wp14:editId="2D7BC353" wp14:anchorId="1409C526">
             <wp:extent cx="5943600" cy="3352800"/>
             <wp:effectExtent l="0" t="0" r="0" b="0"/>
             <wp:docPr id="405049649" name="drawing"/>
@@ -315,7 +315,7 @@
       </w:r>
       <w:r>
         <w:drawing>
-          <wp:inline wp14:editId="38EB4CF4" wp14:anchorId="6ED43297">
+          <wp:inline wp14:editId="3FA77884" wp14:anchorId="6ED43297">
             <wp:extent cx="5943600" cy="3352800"/>
             <wp:effectExtent l="0" t="0" r="0" b="0"/>
             <wp:docPr id="2055515656" name="drawing"/>
@@ -331,6 +331,49 @@
                   </pic:nvPicPr>
                   <pic:blipFill>
                     <a:blip xmlns:r="http://schemas.openxmlformats.org/officeDocument/2006/relationships" r:embed="rId859261542">
+                      <a:extLst>
+                        <a:ext uri="{28A0092B-C50C-407E-A947-70E740481C1C}">
+                          <a14:useLocalDpi xmlns:a14="http://schemas.microsoft.com/office/drawing/2010/main"/>
+                        </a:ext>
+                      </a:extLst>
+                    </a:blip>
+                    <a:stretch>
+                      <a:fillRect/>
+                    </a:stretch>
+                  </pic:blipFill>
+                  <pic:spPr>
+                    <a:xfrm>
+                      <a:off x="0" y="0"/>
+                      <a:ext cx="5943600" cy="3352800"/>
+                    </a:xfrm>
+                    <a:prstGeom prst="rect">
+                      <a:avLst/>
+                    </a:prstGeom>
+                  </pic:spPr>
+                </pic:pic>
+              </a:graphicData>
+            </a:graphic>
+          </wp:inline>
+        </w:drawing>
+      </w:r>
+      <w:r>
+        <w:drawing>
+          <wp:inline wp14:editId="4C24DFA3" wp14:anchorId="5ECAD057">
+            <wp:extent cx="5943600" cy="3352800"/>
+            <wp:effectExtent l="0" t="0" r="0" b="0"/>
+            <wp:docPr id="1988306973" name="drawing"/>
+            <wp:cNvGraphicFramePr>
+              <a:graphicFrameLocks noChangeAspect="1"/>
+            </wp:cNvGraphicFramePr>
+            <a:graphic>
+              <a:graphicData xmlns:a="http://schemas.openxmlformats.org/drawingml/2006/main" uri="http://schemas.openxmlformats.org/drawingml/2006/picture">
+                <pic:pic xmlns:pic="http://schemas.openxmlformats.org/drawingml/2006/picture">
+                  <pic:nvPicPr>
+                    <pic:cNvPr id="1988306973" name="Picture 1988306973"/>
+                    <pic:cNvPicPr/>
+                  </pic:nvPicPr>
+                  <pic:blipFill>
+                    <a:blip xmlns:r="http://schemas.openxmlformats.org/officeDocument/2006/relationships" r:embed="rId906910665">
                       <a:extLst>
                         <a:ext uri="{28A0092B-C50C-407E-A947-70E740481C1C}">
                           <a14:useLocalDpi xmlns:a14="http://schemas.microsoft.com/office/drawing/2010/main"/>

</xml_diff>